<commit_message>
Replace blurry exam scans with clean editable Word/PDF rebuilds.
Co-authored-by: Cursor <cursoragent@cursor.com>
</commit_message>
<xml_diff>
--- a/printables/u01/04-考前测试/U1_四上_第一单元_大数的认识.docx
+++ b/printables/u01/04-考前测试/U1_四上_第一单元_大数的认识.docx
@@ -4,34 +4,7 @@
   <w:body>
     <w:p>
       <w:pPr>
-        <w:jc w:val="center"/>
-      </w:pPr>
-      <w:r>
-        <w:rPr>
-          <w:rFonts w:ascii="宋体" w:hAnsi="宋体" w:eastAsia="宋体"/>
-          <w:b/>
-          <w:color w:val="1E7EB8"/>
-          <w:sz w:val="36"/>
-        </w:rPr>
-        <w:t>数学书桌 · Math Desk</w:t>
-      </w:r>
-    </w:p>
-    <w:p>
-      <w:pPr>
-        <w:jc w:val="center"/>
-      </w:pPr>
-      <w:r>
-        <w:rPr>
-          <w:rFonts w:ascii="宋体" w:hAnsi="宋体" w:eastAsia="宋体"/>
-          <w:b/>
-          <w:color w:val="0F5F8A"/>
-          <w:sz w:val="28"/>
-        </w:rPr>
-        <w:t>四上 · 第一单元·大数的认识</w:t>
-      </w:r>
-    </w:p>
-    <w:p>
-      <w:pPr>
+        <w:spacing w:before="0" w:after="40" w:line="240" w:lineRule="auto"/>
         <w:jc w:val="center"/>
       </w:pPr>
       <w:r>
@@ -41,18 +14,485 @@
           <w:color w:val="1E7EB8"/>
           <w:sz w:val="20"/>
         </w:rPr>
-        <w:t>完整卷（与源扫描页一致）　|　共4页　|　主色：天蓝</w:t>
+        <w:t>数学书桌 · Math Desk</w:t>
       </w:r>
     </w:p>
     <w:p>
+      <w:pPr>
+        <w:spacing w:before="0" w:after="40" w:line="240" w:lineRule="auto"/>
+        <w:jc w:val="center"/>
+      </w:pPr>
+      <w:r>
+        <w:rPr>
+          <w:rFonts w:ascii="宋体" w:hAnsi="宋体" w:eastAsia="宋体"/>
+          <w:b/>
+          <w:color w:val="0F5F8A"/>
+          <w:sz w:val="32"/>
+        </w:rPr>
+        <w:t>数学 · 四上 · 第一单元练习</w:t>
+      </w:r>
+    </w:p>
+    <w:p>
+      <w:pPr>
+        <w:spacing w:before="0" w:after="120" w:line="240" w:lineRule="auto"/>
+        <w:jc w:val="center"/>
+      </w:pPr>
       <w:r>
         <w:rPr>
           <w:rFonts w:ascii="宋体" w:hAnsi="宋体" w:eastAsia="宋体"/>
           <w:b w:val="0"/>
+          <w:sz w:val="22"/>
+        </w:rPr>
+        <w:t>时间：40 分钟</w:t>
+      </w:r>
+    </w:p>
+    <w:p>
+      <w:pPr>
+        <w:spacing w:before="0" w:after="200" w:line="240" w:lineRule="auto"/>
+        <w:jc w:val="center"/>
+      </w:pPr>
+      <w:r>
+        <w:rPr>
+          <w:rFonts w:ascii="宋体" w:hAnsi="宋体" w:eastAsia="宋体"/>
+          <w:b w:val="0"/>
+          <w:sz w:val="22"/>
+        </w:rPr>
+        <w:t>学校____________　四年级____班　姓名____________</w:t>
+      </w:r>
+    </w:p>
+    <w:p>
+      <w:pPr>
+        <w:spacing w:before="160" w:after="120" w:line="240" w:lineRule="auto"/>
+      </w:pPr>
+      <w:r>
+        <w:rPr>
+          <w:rFonts w:ascii="宋体" w:hAnsi="宋体" w:eastAsia="宋体"/>
+          <w:b/>
           <w:color w:val="0F5F8A"/>
+          <w:sz w:val="24"/>
+        </w:rPr>
+        <w:t>一、填空。</w:t>
+      </w:r>
+    </w:p>
+    <w:p>
+      <w:pPr>
+        <w:spacing w:before="0" w:after="80" w:line="240" w:lineRule="auto"/>
+      </w:pPr>
+      <w:r>
+        <w:rPr>
+          <w:rFonts w:ascii="宋体" w:hAnsi="宋体" w:eastAsia="宋体"/>
+          <w:b w:val="0"/>
+          <w:sz w:val="22"/>
+        </w:rPr>
+        <w:t>1. 10 个一万是（　　），10 个一百万是（　　），一千万是（　　）个十万，一亿是（　　）个一百万。</w:t>
+      </w:r>
+    </w:p>
+    <w:p>
+      <w:pPr>
+        <w:spacing w:before="0" w:after="80" w:line="240" w:lineRule="auto"/>
+      </w:pPr>
+      <w:r>
+        <w:rPr>
+          <w:rFonts w:ascii="宋体" w:hAnsi="宋体" w:eastAsia="宋体"/>
+          <w:b w:val="0"/>
+          <w:sz w:val="22"/>
+        </w:rPr>
+        <w:t>2. 在 ○ 里填“＞”“＜”或“＝”。</w:t>
+      </w:r>
+    </w:p>
+    <w:p>
+      <w:pPr>
+        <w:spacing w:before="0" w:after="80" w:line="240" w:lineRule="auto"/>
+      </w:pPr>
+      <w:r>
+        <w:rPr>
+          <w:rFonts w:ascii="宋体" w:hAnsi="宋体" w:eastAsia="宋体"/>
+          <w:b w:val="0"/>
+          <w:sz w:val="22"/>
+        </w:rPr>
+        <w:t xml:space="preserve">　　5430079 ○ 5430790　　1010100 ○ 110100</w:t>
+      </w:r>
+    </w:p>
+    <w:p>
+      <w:pPr>
+        <w:spacing w:before="0" w:after="80" w:line="240" w:lineRule="auto"/>
+      </w:pPr>
+      <w:r>
+        <w:rPr>
+          <w:rFonts w:ascii="宋体" w:hAnsi="宋体" w:eastAsia="宋体"/>
+          <w:b w:val="0"/>
+          <w:sz w:val="22"/>
+        </w:rPr>
+        <w:t xml:space="preserve">　　48 万 ○ 480000　　　　6299000 ○ 630 万</w:t>
+      </w:r>
+    </w:p>
+    <w:p>
+      <w:pPr>
+        <w:spacing w:before="0" w:after="80" w:line="240" w:lineRule="auto"/>
+      </w:pPr>
+      <w:r>
+        <w:rPr>
+          <w:rFonts w:ascii="宋体" w:hAnsi="宋体" w:eastAsia="宋体"/>
+          <w:b w:val="0"/>
+          <w:sz w:val="22"/>
+        </w:rPr>
+        <w:t>3. 马里亚纳海沟最深处为 11034 米。横线上的数读作（　　　　　　　　）米。它是由（　　）个万和（　　）个一组成的。</w:t>
+      </w:r>
+    </w:p>
+    <w:p>
+      <w:pPr>
+        <w:spacing w:before="0" w:after="80" w:line="240" w:lineRule="auto"/>
+      </w:pPr>
+      <w:r>
+        <w:rPr>
+          <w:rFonts w:ascii="宋体" w:hAnsi="宋体" w:eastAsia="宋体"/>
+          <w:b w:val="0"/>
+          <w:sz w:val="22"/>
+        </w:rPr>
+        <w:t>4. 一个八位数，各个数位上都是 9，再加上 1，得到的数是（　　　　　　）。新得到的这个数是（　　）位数，最高位在（　　）位上。</w:t>
+      </w:r>
+    </w:p>
+    <w:p>
+      <w:pPr>
+        <w:spacing w:before="0" w:after="80" w:line="240" w:lineRule="auto"/>
+      </w:pPr>
+      <w:r>
+        <w:rPr>
+          <w:rFonts w:ascii="宋体" w:hAnsi="宋体" w:eastAsia="宋体"/>
+          <w:b w:val="0"/>
+          <w:sz w:val="22"/>
+        </w:rPr>
+        <w:t>5. 从月球到地球的平均距离约三十八万四千四百千米。横线上的数写作（　　　　）千米，省略“万”后面的尾数约是（　　）万千米。</w:t>
+      </w:r>
+    </w:p>
+    <w:p>
+      <w:pPr>
+        <w:spacing w:before="0" w:after="80" w:line="240" w:lineRule="auto"/>
+      </w:pPr>
+      <w:r>
+        <w:rPr>
+          <w:rFonts w:ascii="宋体" w:hAnsi="宋体" w:eastAsia="宋体"/>
+          <w:b w:val="0"/>
+          <w:sz w:val="22"/>
+        </w:rPr>
+        <w:t>6. 28058306 这个数中，万级的数字 8 表示（　　　　　　），个级的数字 8 表示（　　　　　　）。</w:t>
+      </w:r>
+    </w:p>
+    <w:p>
+      <w:pPr>
+        <w:spacing w:before="0" w:after="80" w:line="240" w:lineRule="auto"/>
+      </w:pPr>
+      <w:r>
+        <w:rPr>
+          <w:rFonts w:ascii="宋体" w:hAnsi="宋体" w:eastAsia="宋体"/>
+          <w:b w:val="0"/>
+          <w:sz w:val="22"/>
+        </w:rPr>
+        <w:t>7. 8□989≈8 万，□里可以填（　　　　）；10□0074000≈11 亿，□里可以填（　　　　）。</w:t>
+      </w:r>
+    </w:p>
+    <w:p>
+      <w:pPr>
+        <w:spacing w:before="0" w:after="80" w:line="240" w:lineRule="auto"/>
+      </w:pPr>
+      <w:r>
+        <w:rPr>
+          <w:rFonts w:ascii="宋体" w:hAnsi="宋体" w:eastAsia="宋体"/>
+          <w:b w:val="0"/>
+          <w:sz w:val="22"/>
+        </w:rPr>
+        <w:t>8. 35□8270060 是一个十位数，□里填（　　）时，这个数最接近 35 亿；如果这个数最接近 36 亿，□里应填（　　）。</w:t>
+      </w:r>
+    </w:p>
+    <w:p>
+      <w:pPr>
+        <w:spacing w:before="0" w:after="80" w:line="240" w:lineRule="auto"/>
+      </w:pPr>
+      <w:r>
+        <w:rPr>
+          <w:rFonts w:ascii="宋体" w:hAnsi="宋体" w:eastAsia="宋体"/>
+          <w:b w:val="0"/>
+          <w:sz w:val="22"/>
+        </w:rPr>
+        <w:t>9. 算盘是我国古代的伟大发明。如图（原卷算盘图：十万位上珠为 5，万位下珠为 3），算盘表示的数写作______________。请在下面数线上用“↑”标出这个数的大致位置。</w:t>
+      </w:r>
+    </w:p>
+    <w:p>
+      <w:pPr>
+        <w:spacing w:before="0" w:after="80" w:line="240" w:lineRule="auto"/>
+      </w:pPr>
+      <w:r>
+        <w:rPr>
+          <w:rFonts w:ascii="宋体" w:hAnsi="宋体" w:eastAsia="宋体"/>
+          <w:b w:val="0"/>
           <w:sz w:val="18"/>
         </w:rPr>
-        <w:t>说明：下列各页为源卷高清拆页（放大锐化），内容与 JPG/PNG 扫描一致；缺页待你补图后可再生成。答案见 answers/ 目录。</w:t>
+        <w:t xml:space="preserve">　　50万　|--------|--------|--------|--------|--------|--------|--------|--------|--------|--------|　60万</w:t>
+      </w:r>
+    </w:p>
+    <w:p>
+      <w:pPr>
+        <w:spacing w:before="0" w:after="80" w:line="240" w:lineRule="auto"/>
+      </w:pPr>
+      <w:r>
+        <w:rPr>
+          <w:rFonts w:ascii="宋体" w:hAnsi="宋体" w:eastAsia="宋体"/>
+          <w:b w:val="0"/>
+          <w:color w:val="1E7EB8"/>
+          <w:sz w:val="18"/>
+        </w:rPr>
+        <w:t xml:space="preserve">　　　　　　　　　　　　　（在约 53 万处标 ↑）</w:t>
+      </w:r>
+    </w:p>
+    <w:p>
+      <w:pPr>
+        <w:spacing w:before="0" w:after="80" w:line="240" w:lineRule="auto"/>
+      </w:pPr>
+      <w:r>
+        <w:rPr>
+          <w:rFonts w:ascii="宋体" w:hAnsi="宋体" w:eastAsia="宋体"/>
+          <w:b w:val="0"/>
+          <w:sz w:val="22"/>
+        </w:rPr>
+        <w:t>10. 11 颗珠子，放在不同数位上表示的数不同。下表表示五位数 51023。</w:t>
+      </w:r>
+    </w:p>
+    <w:tbl>
+      <w:tblPr>
+        <w:tblStyle w:val="TableGrid"/>
+        <w:tblW w:type="auto" w:w="0"/>
+        <w:tblLook w:firstColumn="1" w:firstRow="1" w:lastColumn="0" w:lastRow="0" w:noHBand="0" w:noVBand="1" w:val="04A0"/>
+      </w:tblPr>
+      <w:tblGrid>
+        <w:gridCol w:w="2018"/>
+        <w:gridCol w:w="2018"/>
+        <w:gridCol w:w="2018"/>
+        <w:gridCol w:w="2018"/>
+        <w:gridCol w:w="2018"/>
+      </w:tblGrid>
+      <w:tr>
+        <w:tc>
+          <w:tcPr>
+            <w:tcW w:type="dxa" w:w="2018"/>
+          </w:tcPr>
+          <w:p>
+            <w:r>
+              <w:t>万位</w:t>
+            </w:r>
+          </w:p>
+        </w:tc>
+        <w:tc>
+          <w:tcPr>
+            <w:tcW w:type="dxa" w:w="2018"/>
+          </w:tcPr>
+          <w:p>
+            <w:r>
+              <w:t>千位</w:t>
+            </w:r>
+          </w:p>
+        </w:tc>
+        <w:tc>
+          <w:tcPr>
+            <w:tcW w:type="dxa" w:w="2018"/>
+          </w:tcPr>
+          <w:p>
+            <w:r>
+              <w:t>百位</w:t>
+            </w:r>
+          </w:p>
+        </w:tc>
+        <w:tc>
+          <w:tcPr>
+            <w:tcW w:type="dxa" w:w="2018"/>
+          </w:tcPr>
+          <w:p>
+            <w:r>
+              <w:t>十位</w:t>
+            </w:r>
+          </w:p>
+        </w:tc>
+        <w:tc>
+          <w:tcPr>
+            <w:tcW w:type="dxa" w:w="2018"/>
+          </w:tcPr>
+          <w:p>
+            <w:r>
+              <w:t>个位</w:t>
+            </w:r>
+          </w:p>
+        </w:tc>
+      </w:tr>
+      <w:tr>
+        <w:tc>
+          <w:tcPr>
+            <w:tcW w:type="dxa" w:w="2018"/>
+          </w:tcPr>
+          <w:p>
+            <w:r>
+              <w:t>●●●●●</w:t>
+            </w:r>
+          </w:p>
+        </w:tc>
+        <w:tc>
+          <w:tcPr>
+            <w:tcW w:type="dxa" w:w="2018"/>
+          </w:tcPr>
+          <w:p>
+            <w:r>
+              <w:t>●</w:t>
+            </w:r>
+          </w:p>
+        </w:tc>
+        <w:tc>
+          <w:tcPr>
+            <w:tcW w:type="dxa" w:w="2018"/>
+          </w:tcPr>
+          <w:p>
+            <w:r>
+              <w:t>（空）</w:t>
+            </w:r>
+          </w:p>
+        </w:tc>
+        <w:tc>
+          <w:tcPr>
+            <w:tcW w:type="dxa" w:w="2018"/>
+          </w:tcPr>
+          <w:p>
+            <w:r>
+              <w:t>●●</w:t>
+            </w:r>
+          </w:p>
+        </w:tc>
+        <w:tc>
+          <w:tcPr>
+            <w:tcW w:type="dxa" w:w="2018"/>
+          </w:tcPr>
+          <w:p>
+            <w:r>
+              <w:t>●●●</w:t>
+            </w:r>
+          </w:p>
+        </w:tc>
+      </w:tr>
+    </w:tbl>
+    <w:p>
+      <w:pPr>
+        <w:spacing w:before="0" w:after="160" w:line="240" w:lineRule="auto"/>
+      </w:pPr>
+      <w:r>
+        <w:rPr>
+          <w:rFonts w:ascii="宋体" w:hAnsi="宋体" w:eastAsia="宋体"/>
+          <w:b w:val="0"/>
+          <w:sz w:val="22"/>
+        </w:rPr>
+        <w:t>如果用这 11 颗珠子组成一个新的五位数（每个数位上都要有珠子），这个五位数最大是（　　　　）。</w:t>
+      </w:r>
+    </w:p>
+    <w:p>
+      <w:pPr>
+        <w:spacing w:before="160" w:after="120" w:line="240" w:lineRule="auto"/>
+      </w:pPr>
+      <w:r>
+        <w:rPr>
+          <w:rFonts w:ascii="宋体" w:hAnsi="宋体" w:eastAsia="宋体"/>
+          <w:b/>
+          <w:color w:val="0F5F8A"/>
+          <w:sz w:val="24"/>
+        </w:rPr>
+        <w:t>二、选一选。</w:t>
+      </w:r>
+    </w:p>
+    <w:p>
+      <w:pPr>
+        <w:spacing w:before="0" w:after="80" w:line="240" w:lineRule="auto"/>
+      </w:pPr>
+      <w:r>
+        <w:rPr>
+          <w:rFonts w:ascii="宋体" w:hAnsi="宋体" w:eastAsia="宋体"/>
+          <w:b w:val="0"/>
+          <w:sz w:val="22"/>
+        </w:rPr>
+        <w:t>1. 543100 中的“3”表示（　　）。</w:t>
+      </w:r>
+    </w:p>
+    <w:p>
+      <w:pPr>
+        <w:spacing w:before="0" w:after="80" w:line="240" w:lineRule="auto"/>
+      </w:pPr>
+      <w:r>
+        <w:rPr>
+          <w:rFonts w:ascii="宋体" w:hAnsi="宋体" w:eastAsia="宋体"/>
+          <w:b w:val="0"/>
+          <w:sz w:val="22"/>
+        </w:rPr>
+        <w:t xml:space="preserve">　　① 3 个一百　　② 3 个一千　　③ 3 个一万　　④ 3 个十万</w:t>
+      </w:r>
+    </w:p>
+    <w:p>
+      <w:pPr>
+        <w:spacing w:before="0" w:after="80" w:line="240" w:lineRule="auto"/>
+      </w:pPr>
+      <w:r>
+        <w:rPr>
+          <w:rFonts w:ascii="宋体" w:hAnsi="宋体" w:eastAsia="宋体"/>
+          <w:b w:val="0"/>
+          <w:sz w:val="22"/>
+        </w:rPr>
+        <w:t>2. 有一个数，万级上是 406，个级上是 273，这个数是（　　）。</w:t>
+      </w:r>
+    </w:p>
+    <w:p>
+      <w:pPr>
+        <w:spacing w:before="0" w:after="80" w:line="240" w:lineRule="auto"/>
+      </w:pPr>
+      <w:r>
+        <w:rPr>
+          <w:rFonts w:ascii="宋体" w:hAnsi="宋体" w:eastAsia="宋体"/>
+          <w:b w:val="0"/>
+          <w:sz w:val="22"/>
+        </w:rPr>
+        <w:t xml:space="preserve">　　① 406273　　② 4060273　　③ 4062730　　④ 40600273</w:t>
+      </w:r>
+    </w:p>
+    <w:p>
+      <w:pPr>
+        <w:spacing w:before="0" w:after="80" w:line="240" w:lineRule="auto"/>
+      </w:pPr>
+      <w:r>
+        <w:rPr>
+          <w:rFonts w:ascii="宋体" w:hAnsi="宋体" w:eastAsia="宋体"/>
+          <w:b w:val="0"/>
+          <w:sz w:val="22"/>
+        </w:rPr>
+        <w:t>3. 在数字 4 和 7 之间添（　　）个 0，可以组成四千万零七。</w:t>
+      </w:r>
+    </w:p>
+    <w:p>
+      <w:pPr>
+        <w:spacing w:before="0" w:after="80" w:line="240" w:lineRule="auto"/>
+      </w:pPr>
+      <w:r>
+        <w:rPr>
+          <w:rFonts w:ascii="宋体" w:hAnsi="宋体" w:eastAsia="宋体"/>
+          <w:b w:val="0"/>
+          <w:sz w:val="22"/>
+        </w:rPr>
+        <w:t xml:space="preserve">　　① 4　　② 5　　③ 6　　④ 7</w:t>
+      </w:r>
+    </w:p>
+    <w:p>
+      <w:pPr>
+        <w:spacing w:before="0" w:after="0" w:line="240" w:lineRule="auto"/>
+        <w:jc w:val="center"/>
+      </w:pPr>
+      <w:r>
+        <w:rPr>
+          <w:rFonts w:ascii="宋体" w:hAnsi="宋体" w:eastAsia="宋体"/>
+          <w:b w:val="0"/>
+          <w:color w:val="1E7EB8"/>
+          <w:sz w:val="16"/>
+        </w:rPr>
+        <w:t>数学 · 四上 · 第一单元　第 1 页（共 4 页）　|　清晰重排版（非扫描放大）</w:t>
       </w:r>
     </w:p>
     <w:p>
@@ -62,52 +502,400 @@
     </w:p>
     <w:p>
       <w:pPr>
+        <w:spacing w:before="160" w:after="120" w:line="240" w:lineRule="auto"/>
+      </w:pPr>
+      <w:r>
+        <w:rPr>
+          <w:rFonts w:ascii="宋体" w:hAnsi="宋体" w:eastAsia="宋体"/>
+          <w:b/>
+          <w:color w:val="0F5F8A"/>
+          <w:sz w:val="24"/>
+        </w:rPr>
+        <w:t>二、选一选。（续）</w:t>
+      </w:r>
+    </w:p>
+    <w:p>
+      <w:pPr>
+        <w:spacing w:before="0" w:after="80" w:line="240" w:lineRule="auto"/>
+      </w:pPr>
+      <w:r>
+        <w:rPr>
+          <w:rFonts w:ascii="宋体" w:hAnsi="宋体" w:eastAsia="宋体"/>
+          <w:b w:val="0"/>
+          <w:sz w:val="22"/>
+        </w:rPr>
+        <w:t>4. 四位同学用不同方法表示 120000，其中不正确的是（　　）。</w:t>
+      </w:r>
+    </w:p>
+    <w:p>
+      <w:pPr>
+        <w:spacing w:before="0" w:after="80" w:line="240" w:lineRule="auto"/>
+      </w:pPr>
+      <w:r>
+        <w:rPr>
+          <w:rFonts w:ascii="宋体" w:hAnsi="宋体" w:eastAsia="宋体"/>
+          <w:b w:val="0"/>
+          <w:sz w:val="22"/>
+        </w:rPr>
+        <w:t xml:space="preserve">　　① 计数器：十万位拨 1，万位拨 2（表示 120000）</w:t>
+      </w:r>
+    </w:p>
+    <w:p>
+      <w:pPr>
+        <w:spacing w:before="0" w:after="80" w:line="240" w:lineRule="auto"/>
+      </w:pPr>
+      <w:r>
+        <w:rPr>
+          <w:rFonts w:ascii="宋体" w:hAnsi="宋体" w:eastAsia="宋体"/>
+          <w:b w:val="0"/>
+          <w:sz w:val="22"/>
+        </w:rPr>
+        <w:t xml:space="preserve">　　② 用小正方形表示，每格表示 1000，画了 120 格</w:t>
+      </w:r>
+    </w:p>
+    <w:p>
+      <w:pPr>
+        <w:spacing w:before="0" w:after="80" w:line="240" w:lineRule="auto"/>
+      </w:pPr>
+      <w:r>
+        <w:rPr>
+          <w:rFonts w:ascii="宋体" w:hAnsi="宋体" w:eastAsia="宋体"/>
+          <w:b w:val="0"/>
+          <w:sz w:val="22"/>
+        </w:rPr>
+        <w:t xml:space="preserve">　　③ 数线：10万——20万，箭头指在正中间（约 15万）</w:t>
+      </w:r>
+    </w:p>
+    <w:p>
+      <w:pPr>
+        <w:spacing w:before="0" w:after="80" w:line="240" w:lineRule="auto"/>
+      </w:pPr>
+      <w:r>
+        <w:rPr>
+          <w:rFonts w:ascii="宋体" w:hAnsi="宋体" w:eastAsia="宋体"/>
+          <w:b w:val="0"/>
+          <w:sz w:val="22"/>
+        </w:rPr>
+        <w:t xml:space="preserve">　　④ 1×100000＋2×10000</w:t>
+      </w:r>
+    </w:p>
+    <w:p>
+      <w:pPr>
+        <w:spacing w:before="0" w:after="80" w:line="240" w:lineRule="auto"/>
+      </w:pPr>
+      <w:r>
+        <w:rPr>
+          <w:rFonts w:ascii="宋体" w:hAnsi="宋体" w:eastAsia="宋体"/>
+          <w:b w:val="0"/>
+          <w:sz w:val="22"/>
+        </w:rPr>
+        <w:t>5. 一个数的近似数是 476 万。如果原来这个数万位上的数字是 6，那么原来千位上的数字最大是（　　）。</w:t>
+      </w:r>
+    </w:p>
+    <w:p>
+      <w:pPr>
+        <w:spacing w:before="0" w:after="80" w:line="240" w:lineRule="auto"/>
+      </w:pPr>
+      <w:r>
+        <w:rPr>
+          <w:rFonts w:ascii="宋体" w:hAnsi="宋体" w:eastAsia="宋体"/>
+          <w:b w:val="0"/>
+          <w:sz w:val="22"/>
+        </w:rPr>
+        <w:t xml:space="preserve">　　① 4　　② 5　　③ 0　　④ 9</w:t>
+      </w:r>
+    </w:p>
+    <w:p>
+      <w:pPr>
+        <w:spacing w:before="0" w:after="80" w:line="240" w:lineRule="auto"/>
+      </w:pPr>
+      <w:r>
+        <w:rPr>
+          <w:rFonts w:ascii="宋体" w:hAnsi="宋体" w:eastAsia="宋体"/>
+          <w:b w:val="0"/>
+          <w:sz w:val="22"/>
+        </w:rPr>
+        <w:t>6. 下面四个数中，（　　）可能是图中 M 点表示的数。</w:t>
+      </w:r>
+    </w:p>
+    <w:p>
+      <w:pPr>
+        <w:spacing w:before="0" w:after="80" w:line="240" w:lineRule="auto"/>
+      </w:pPr>
+      <w:r>
+        <w:rPr>
+          <w:rFonts w:ascii="宋体" w:hAnsi="宋体" w:eastAsia="宋体"/>
+          <w:b w:val="0"/>
+          <w:sz w:val="22"/>
+        </w:rPr>
+        <w:t xml:space="preserve">　　数线：50000——60000——70000，M 在 60000 与 70000 之间且靠近 60000 一侧约三分之一处。</w:t>
+      </w:r>
+    </w:p>
+    <w:p>
+      <w:pPr>
+        <w:spacing w:before="0" w:after="80" w:line="240" w:lineRule="auto"/>
+      </w:pPr>
+      <w:r>
+        <w:rPr>
+          <w:rFonts w:ascii="宋体" w:hAnsi="宋体" w:eastAsia="宋体"/>
+          <w:b w:val="0"/>
+          <w:sz w:val="22"/>
+        </w:rPr>
+        <w:t xml:space="preserve">　　① 63000　　② 65000　　③ 67000　　④ 69000</w:t>
+      </w:r>
+    </w:p>
+    <w:p>
+      <w:pPr>
+        <w:spacing w:before="160" w:after="120" w:line="240" w:lineRule="auto"/>
+      </w:pPr>
+      <w:r>
+        <w:rPr>
+          <w:rFonts w:ascii="宋体" w:hAnsi="宋体" w:eastAsia="宋体"/>
+          <w:b/>
+          <w:color w:val="0F5F8A"/>
+          <w:sz w:val="24"/>
+        </w:rPr>
+        <w:t>三、按要求完成下面各题。</w:t>
+      </w:r>
+    </w:p>
+    <w:p>
+      <w:pPr>
+        <w:spacing w:before="0" w:after="80" w:line="240" w:lineRule="auto"/>
+      </w:pPr>
+      <w:r>
+        <w:rPr>
+          <w:rFonts w:ascii="宋体" w:hAnsi="宋体" w:eastAsia="宋体"/>
+          <w:b w:val="0"/>
+          <w:sz w:val="22"/>
+        </w:rPr>
+        <w:t>1. 连一连（把读 0 的情况与数连起来）。</w:t>
+      </w:r>
+    </w:p>
+    <w:p>
+      <w:pPr>
+        <w:spacing w:before="0" w:after="80" w:line="240" w:lineRule="auto"/>
+      </w:pPr>
+      <w:r>
+        <w:rPr>
+          <w:rFonts w:ascii="宋体" w:hAnsi="宋体" w:eastAsia="宋体"/>
+          <w:b w:val="0"/>
+          <w:sz w:val="22"/>
+        </w:rPr>
+        <w:t xml:space="preserve">　　一个 0 都不读　　读出一个 0　　读出两个 0</w:t>
+      </w:r>
+    </w:p>
+    <w:p>
+      <w:pPr>
+        <w:spacing w:before="0" w:after="80" w:line="240" w:lineRule="auto"/>
+      </w:pPr>
+      <w:r>
+        <w:rPr>
+          <w:rFonts w:ascii="宋体" w:hAnsi="宋体" w:eastAsia="宋体"/>
+          <w:b w:val="0"/>
+          <w:sz w:val="22"/>
+        </w:rPr>
+        <w:t xml:space="preserve">　　80072050　　80700025　　87025000　　87205000</w:t>
+      </w:r>
+    </w:p>
+    <w:p>
+      <w:pPr>
+        <w:spacing w:before="0" w:after="80" w:line="240" w:lineRule="auto"/>
+      </w:pPr>
+      <w:r>
+        <w:rPr>
+          <w:rFonts w:ascii="宋体" w:hAnsi="宋体" w:eastAsia="宋体"/>
+          <w:b w:val="0"/>
+          <w:sz w:val="22"/>
+        </w:rPr>
+        <w:t>2. 填上合适的数。</w:t>
+      </w:r>
+    </w:p>
+    <w:p>
+      <w:pPr>
+        <w:spacing w:before="0" w:after="80" w:line="240" w:lineRule="auto"/>
+      </w:pPr>
+      <w:r>
+        <w:rPr>
+          <w:rFonts w:ascii="宋体" w:hAnsi="宋体" w:eastAsia="宋体"/>
+          <w:b w:val="0"/>
+          <w:sz w:val="22"/>
+        </w:rPr>
+        <w:t xml:space="preserve">　　(1) 379614＝100000×（　）＋（　）×7＋（　）×9＋100×（　）＋10×（　）＋（　）×1</w:t>
+      </w:r>
+    </w:p>
+    <w:p>
+      <w:pPr>
+        <w:spacing w:before="0" w:after="80" w:line="240" w:lineRule="auto"/>
+      </w:pPr>
+      <w:r>
+        <w:rPr>
+          <w:rFonts w:ascii="宋体" w:hAnsi="宋体" w:eastAsia="宋体"/>
+          <w:b w:val="0"/>
+          <w:sz w:val="22"/>
+        </w:rPr>
+        <w:t xml:space="preserve">　　(2) 在数线 50000——60000——70000 上，标出约 55000 与约 63000 的位置（用方框标数）。</w:t>
+      </w:r>
+    </w:p>
+    <w:p>
+      <w:pPr>
+        <w:spacing w:before="0" w:after="80" w:line="240" w:lineRule="auto"/>
+      </w:pPr>
+      <w:r>
+        <w:rPr>
+          <w:rFonts w:ascii="宋体" w:hAnsi="宋体" w:eastAsia="宋体"/>
+          <w:b w:val="0"/>
+          <w:sz w:val="22"/>
+        </w:rPr>
+        <w:t>3. 将表格中四大行星到太阳的平均距离按从大到小的顺序排一排。</w:t>
+      </w:r>
+    </w:p>
+    <w:tbl>
+      <w:tblPr>
+        <w:tblStyle w:val="TableGrid"/>
+        <w:tblW w:type="auto" w:w="0"/>
+        <w:tblLook w:firstColumn="1" w:firstRow="1" w:lastColumn="0" w:lastRow="0" w:noHBand="0" w:noVBand="1" w:val="04A0"/>
+      </w:tblPr>
+      <w:tblGrid>
+        <w:gridCol w:w="5046"/>
+        <w:gridCol w:w="5046"/>
+      </w:tblGrid>
+      <w:tr>
+        <w:tc>
+          <w:tcPr>
+            <w:tcW w:type="dxa" w:w="5046"/>
+          </w:tcPr>
+          <w:p>
+            <w:r>
+              <w:t>行星</w:t>
+            </w:r>
+          </w:p>
+        </w:tc>
+        <w:tc>
+          <w:tcPr>
+            <w:tcW w:type="dxa" w:w="5046"/>
+          </w:tcPr>
+          <w:p>
+            <w:r>
+              <w:t>平均距离（千米）</w:t>
+            </w:r>
+          </w:p>
+        </w:tc>
+      </w:tr>
+      <w:tr>
+        <w:tc>
+          <w:tcPr>
+            <w:tcW w:type="dxa" w:w="5046"/>
+          </w:tcPr>
+          <w:p>
+            <w:r>
+              <w:t>地球</w:t>
+            </w:r>
+          </w:p>
+        </w:tc>
+        <w:tc>
+          <w:tcPr>
+            <w:tcW w:type="dxa" w:w="5046"/>
+          </w:tcPr>
+          <w:p>
+            <w:r>
+              <w:t>149600000</w:t>
+            </w:r>
+          </w:p>
+        </w:tc>
+      </w:tr>
+      <w:tr>
+        <w:tc>
+          <w:tcPr>
+            <w:tcW w:type="dxa" w:w="5046"/>
+          </w:tcPr>
+          <w:p>
+            <w:r>
+              <w:t>木星</w:t>
+            </w:r>
+          </w:p>
+        </w:tc>
+        <w:tc>
+          <w:tcPr>
+            <w:tcW w:type="dxa" w:w="5046"/>
+          </w:tcPr>
+          <w:p>
+            <w:r>
+              <w:t>778330000</w:t>
+            </w:r>
+          </w:p>
+        </w:tc>
+      </w:tr>
+      <w:tr>
+        <w:tc>
+          <w:tcPr>
+            <w:tcW w:type="dxa" w:w="5046"/>
+          </w:tcPr>
+          <w:p>
+            <w:r>
+              <w:t>水星</w:t>
+            </w:r>
+          </w:p>
+        </w:tc>
+        <w:tc>
+          <w:tcPr>
+            <w:tcW w:type="dxa" w:w="5046"/>
+          </w:tcPr>
+          <w:p>
+            <w:r>
+              <w:t>57910000</w:t>
+            </w:r>
+          </w:p>
+        </w:tc>
+      </w:tr>
+      <w:tr>
+        <w:tc>
+          <w:tcPr>
+            <w:tcW w:type="dxa" w:w="5046"/>
+          </w:tcPr>
+          <w:p>
+            <w:r>
+              <w:t>金星</w:t>
+            </w:r>
+          </w:p>
+        </w:tc>
+        <w:tc>
+          <w:tcPr>
+            <w:tcW w:type="dxa" w:w="5046"/>
+          </w:tcPr>
+          <w:p>
+            <w:r>
+              <w:t>108200000</w:t>
+            </w:r>
+          </w:p>
+        </w:tc>
+      </w:tr>
+    </w:tbl>
+    <w:p>
+      <w:pPr>
+        <w:spacing w:before="0" w:after="160" w:line="240" w:lineRule="auto"/>
+      </w:pPr>
+      <w:r>
+        <w:rPr>
+          <w:rFonts w:ascii="宋体" w:hAnsi="宋体" w:eastAsia="宋体"/>
+          <w:b w:val="0"/>
+          <w:sz w:val="22"/>
+        </w:rPr>
+        <w:t>从大到小：______________ → ______________ → ______________ → ______________</w:t>
+      </w:r>
+    </w:p>
+    <w:p>
+      <w:pPr>
+        <w:spacing w:before="0" w:after="0" w:line="240" w:lineRule="auto"/>
         <w:jc w:val="center"/>
       </w:pPr>
       <w:r>
         <w:rPr>
           <w:rFonts w:ascii="宋体" w:hAnsi="宋体" w:eastAsia="宋体"/>
-          <w:b/>
+          <w:b w:val="0"/>
           <w:color w:val="1E7EB8"/>
-          <w:sz w:val="20"/>
+          <w:sz w:val="16"/>
         </w:rPr>
-        <w:t>数学书桌 · Math Desk　·　第一单元·大数的认识　·　第 1 页</w:t>
-      </w:r>
-    </w:p>
-    <w:p>
-      <w:r>
-        <w:drawing>
-          <wp:inline xmlns:a="http://schemas.openxmlformats.org/drawingml/2006/main" xmlns:pic="http://schemas.openxmlformats.org/drawingml/2006/picture">
-            <wp:extent cx="6696000" cy="9673267"/>
-            <wp:docPr id="1" name="Picture 1"/>
-            <wp:cNvGraphicFramePr>
-              <a:graphicFrameLocks noChangeAspect="1"/>
-            </wp:cNvGraphicFramePr>
-            <a:graphic>
-              <a:graphicData uri="http://schemas.openxmlformats.org/drawingml/2006/picture">
-                <pic:pic>
-                  <pic:nvPicPr>
-                    <pic:cNvPr id="0" name="u01-p01.png"/>
-                    <pic:cNvPicPr/>
-                  </pic:nvPicPr>
-                  <pic:blipFill>
-                    <a:blip r:embed="rId9"/>
-                    <a:stretch>
-                      <a:fillRect/>
-                    </a:stretch>
-                  </pic:blipFill>
-                  <pic:spPr>
-                    <a:xfrm>
-                      <a:off x="0" y="0"/>
-                      <a:ext cx="6696000" cy="9673267"/>
-                    </a:xfrm>
-                    <a:prstGeom prst="rect"/>
-                  </pic:spPr>
-                </pic:pic>
-              </a:graphicData>
-            </a:graphic>
-          </wp:inline>
-        </w:drawing>
+        <w:t>数学 · 四上 · 第一单元　第 2 页（共 4 页）　|　清晰重排版（非扫描放大）</w:t>
       </w:r>
     </w:p>
     <w:p>
@@ -117,52 +905,189 @@
     </w:p>
     <w:p>
       <w:pPr>
+        <w:spacing w:before="160" w:after="120" w:line="240" w:lineRule="auto"/>
+      </w:pPr>
+      <w:r>
+        <w:rPr>
+          <w:rFonts w:ascii="宋体" w:hAnsi="宋体" w:eastAsia="宋体"/>
+          <w:b/>
+          <w:color w:val="0F5F8A"/>
+          <w:sz w:val="24"/>
+        </w:rPr>
+        <w:t>四、列竖式计算。（带 ※ 的题目要验算）</w:t>
+      </w:r>
+    </w:p>
+    <w:p>
+      <w:pPr>
+        <w:spacing w:before="0" w:after="80" w:line="240" w:lineRule="auto"/>
+      </w:pPr>
+      <w:r>
+        <w:rPr>
+          <w:rFonts w:ascii="宋体" w:hAnsi="宋体" w:eastAsia="宋体"/>
+          <w:b w:val="0"/>
+          <w:sz w:val="22"/>
+        </w:rPr>
+        <w:t>1. 76×45＝　　　　　　2. 21.4－7.9＝</w:t>
+      </w:r>
+    </w:p>
+    <w:p>
+      <w:pPr>
+        <w:spacing w:before="0" w:after="80" w:line="240" w:lineRule="auto"/>
+      </w:pPr>
+      <w:r>
+        <w:rPr>
+          <w:rFonts w:ascii="宋体" w:hAnsi="宋体" w:eastAsia="宋体"/>
+          <w:b w:val="0"/>
+          <w:sz w:val="22"/>
+        </w:rPr>
+      </w:r>
+    </w:p>
+    <w:p>
+      <w:pPr>
+        <w:spacing w:before="0" w:after="80" w:line="240" w:lineRule="auto"/>
+      </w:pPr>
+      <w:r>
+        <w:rPr>
+          <w:rFonts w:ascii="宋体" w:hAnsi="宋体" w:eastAsia="宋体"/>
+          <w:b w:val="0"/>
+          <w:sz w:val="22"/>
+        </w:rPr>
+        <w:t>3. 572÷7＝　　　　　　※4. 843÷5＝</w:t>
+      </w:r>
+    </w:p>
+    <w:p>
+      <w:pPr>
+        <w:spacing w:before="0" w:after="320" w:line="240" w:lineRule="auto"/>
+      </w:pPr>
+      <w:r>
+        <w:rPr>
+          <w:rFonts w:ascii="宋体" w:hAnsi="宋体" w:eastAsia="宋体"/>
+          <w:b w:val="0"/>
+          <w:color w:val="1E7EB8"/>
+          <w:sz w:val="18"/>
+        </w:rPr>
+        <w:t>（请在下方列竖式，※ 题写出验算）</w:t>
+      </w:r>
+    </w:p>
+    <w:p>
+      <w:pPr>
+        <w:spacing w:before="160" w:after="120" w:line="240" w:lineRule="auto"/>
+      </w:pPr>
+      <w:r>
+        <w:rPr>
+          <w:rFonts w:ascii="宋体" w:hAnsi="宋体" w:eastAsia="宋体"/>
+          <w:b/>
+          <w:color w:val="0F5F8A"/>
+          <w:sz w:val="24"/>
+        </w:rPr>
+        <w:t>五、根据要求完成下面各题。</w:t>
+      </w:r>
+    </w:p>
+    <w:p>
+      <w:pPr>
+        <w:spacing w:before="0" w:after="160" w:line="240" w:lineRule="auto"/>
+        <w:ind w:firstLine="420"/>
+      </w:pPr>
+      <w:r>
+        <w:rPr>
+          <w:rFonts w:ascii="宋体" w:hAnsi="宋体" w:eastAsia="宋体"/>
+          <w:b w:val="0"/>
+          <w:sz w:val="20"/>
+        </w:rPr>
+        <w:t>2022 年 2 月 4 日，第 24 届冬季奥林匹克运动会在北京开幕。国家体育场（鸟巢）于 2003 年 12 月 24 日开工建设，2008 年 6 月 28 日竣工，总投资 2267000000 元，建筑面积 258000 平方米，可容纳约 91000 名观众。本届冬奥会，中国体育代表团共获得 9 枚金牌、4 枚银牌、2 枚铜牌，共 15 枚奖牌。</w:t>
+      </w:r>
+    </w:p>
+    <w:p>
+      <w:pPr>
+        <w:spacing w:before="0" w:after="80" w:line="240" w:lineRule="auto"/>
+      </w:pPr>
+      <w:r>
+        <w:rPr>
+          <w:rFonts w:ascii="宋体" w:hAnsi="宋体" w:eastAsia="宋体"/>
+          <w:b w:val="0"/>
+          <w:sz w:val="22"/>
+        </w:rPr>
+        <w:t>1. 2267000000 读作（　　　　　　　　　　　　）。这个数中，左边的“2”在（　　）位上，表示（　　　　）；右边的“2”在（　　）位上，表示（　　　　）。258000 省略万位后面的尾数约是（　　）万。</w:t>
+      </w:r>
+    </w:p>
+    <w:p>
+      <w:pPr>
+        <w:spacing w:before="0" w:after="80" w:line="240" w:lineRule="auto"/>
+      </w:pPr>
+      <w:r>
+        <w:rPr>
+          <w:rFonts w:ascii="宋体" w:hAnsi="宋体" w:eastAsia="宋体"/>
+          <w:b w:val="0"/>
+          <w:sz w:val="22"/>
+        </w:rPr>
+        <w:t>2. 选择：① 准确数　　② 近似数</w:t>
+      </w:r>
+    </w:p>
+    <w:p>
+      <w:pPr>
+        <w:spacing w:before="0" w:after="80" w:line="240" w:lineRule="auto"/>
+      </w:pPr>
+      <w:r>
+        <w:rPr>
+          <w:rFonts w:ascii="宋体" w:hAnsi="宋体" w:eastAsia="宋体"/>
+          <w:b w:val="0"/>
+          <w:sz w:val="22"/>
+        </w:rPr>
+        <w:t xml:space="preserve">　　“可容纳约 91000 名观众”中的 91000 是（　　）；“获得 9 枚金牌”中的 9 是（　　）。</w:t>
+      </w:r>
+    </w:p>
+    <w:p>
+      <w:pPr>
+        <w:spacing w:before="0" w:after="80" w:line="240" w:lineRule="auto"/>
+      </w:pPr>
+      <w:r>
+        <w:rPr>
+          <w:rFonts w:ascii="宋体" w:hAnsi="宋体" w:eastAsia="宋体"/>
+          <w:b w:val="0"/>
+          <w:sz w:val="22"/>
+        </w:rPr>
+        <w:t>3. 冬奥会期间，小明听说“带动约 3 亿人参与冰雪运动”。他想用四舍五入的知识估计：这个“约 3 亿”最多可能表示多少人？请写出你的想法。</w:t>
+      </w:r>
+    </w:p>
+    <w:p>
+      <w:pPr>
+        <w:spacing w:before="0" w:after="80" w:line="240" w:lineRule="auto"/>
+      </w:pPr>
+      <w:r>
+        <w:rPr>
+          <w:rFonts w:ascii="宋体" w:hAnsi="宋体" w:eastAsia="宋体"/>
+          <w:b w:val="0"/>
+          <w:sz w:val="22"/>
+        </w:rPr>
+        <w:t>________________________________________________________________</w:t>
+      </w:r>
+    </w:p>
+    <w:p>
+      <w:pPr>
+        <w:spacing w:before="0" w:after="200" w:line="240" w:lineRule="auto"/>
+      </w:pPr>
+      <w:r>
+        <w:rPr>
+          <w:rFonts w:ascii="宋体" w:hAnsi="宋体" w:eastAsia="宋体"/>
+          <w:b w:val="0"/>
+          <w:sz w:val="22"/>
+        </w:rPr>
+        <w:t>________________________________________________________________</w:t>
+      </w:r>
+    </w:p>
+    <w:p>
+      <w:pPr>
+        <w:spacing w:before="0" w:after="0" w:line="240" w:lineRule="auto"/>
         <w:jc w:val="center"/>
       </w:pPr>
       <w:r>
         <w:rPr>
           <w:rFonts w:ascii="宋体" w:hAnsi="宋体" w:eastAsia="宋体"/>
-          <w:b/>
+          <w:b w:val="0"/>
           <w:color w:val="1E7EB8"/>
-          <w:sz w:val="20"/>
+          <w:sz w:val="16"/>
         </w:rPr>
-        <w:t>数学书桌 · Math Desk　·　第一单元·大数的认识　·　第 2 页</w:t>
-      </w:r>
-    </w:p>
-    <w:p>
-      <w:r>
-        <w:drawing>
-          <wp:inline xmlns:a="http://schemas.openxmlformats.org/drawingml/2006/main" xmlns:pic="http://schemas.openxmlformats.org/drawingml/2006/picture">
-            <wp:extent cx="6696000" cy="9656817"/>
-            <wp:docPr id="2" name="Picture 2"/>
-            <wp:cNvGraphicFramePr>
-              <a:graphicFrameLocks noChangeAspect="1"/>
-            </wp:cNvGraphicFramePr>
-            <a:graphic>
-              <a:graphicData uri="http://schemas.openxmlformats.org/drawingml/2006/picture">
-                <pic:pic>
-                  <pic:nvPicPr>
-                    <pic:cNvPr id="0" name="u01-p02.png"/>
-                    <pic:cNvPicPr/>
-                  </pic:nvPicPr>
-                  <pic:blipFill>
-                    <a:blip r:embed="rId10"/>
-                    <a:stretch>
-                      <a:fillRect/>
-                    </a:stretch>
-                  </pic:blipFill>
-                  <pic:spPr>
-                    <a:xfrm>
-                      <a:off x="0" y="0"/>
-                      <a:ext cx="6696000" cy="9656817"/>
-                    </a:xfrm>
-                    <a:prstGeom prst="rect"/>
-                  </pic:spPr>
-                </pic:pic>
-              </a:graphicData>
-            </a:graphic>
-          </wp:inline>
-        </w:drawing>
+        <w:t>数学 · 四上 · 第一单元　第 3 页（共 4 页）　|　清晰重排版（非扫描放大）</w:t>
       </w:r>
     </w:p>
     <w:p>
@@ -172,112 +1097,49 @@
     </w:p>
     <w:p>
       <w:pPr>
+        <w:spacing w:before="0" w:after="80" w:line="240" w:lineRule="auto"/>
         <w:jc w:val="center"/>
       </w:pPr>
       <w:r>
         <w:rPr>
           <w:rFonts w:ascii="宋体" w:hAnsi="宋体" w:eastAsia="宋体"/>
-          <w:b/>
+          <w:b w:val="0"/>
           <w:color w:val="1E7EB8"/>
           <w:sz w:val="20"/>
         </w:rPr>
-        <w:t>数学书桌 · Math Desk　·　第一单元·大数的认识　·　第 3 页</w:t>
-      </w:r>
-    </w:p>
-    <w:p>
-      <w:r>
-        <w:drawing>
-          <wp:inline xmlns:a="http://schemas.openxmlformats.org/drawingml/2006/main" xmlns:pic="http://schemas.openxmlformats.org/drawingml/2006/picture">
-            <wp:extent cx="6696000" cy="9536382"/>
-            <wp:docPr id="3" name="Picture 3"/>
-            <wp:cNvGraphicFramePr>
-              <a:graphicFrameLocks noChangeAspect="1"/>
-            </wp:cNvGraphicFramePr>
-            <a:graphic>
-              <a:graphicData uri="http://schemas.openxmlformats.org/drawingml/2006/picture">
-                <pic:pic>
-                  <pic:nvPicPr>
-                    <pic:cNvPr id="0" name="u01-p03.png"/>
-                    <pic:cNvPicPr/>
-                  </pic:nvPicPr>
-                  <pic:blipFill>
-                    <a:blip r:embed="rId11"/>
-                    <a:stretch>
-                      <a:fillRect/>
-                    </a:stretch>
-                  </pic:blipFill>
-                  <pic:spPr>
-                    <a:xfrm>
-                      <a:off x="0" y="0"/>
-                      <a:ext cx="6696000" cy="9536382"/>
-                    </a:xfrm>
-                    <a:prstGeom prst="rect"/>
-                  </pic:spPr>
-                </pic:pic>
-              </a:graphicData>
-            </a:graphic>
-          </wp:inline>
-        </w:drawing>
-      </w:r>
-    </w:p>
-    <w:p>
-      <w:r>
-        <w:br w:type="page"/>
+        <w:t>（本页为作答／竖式续写空白页）</w:t>
       </w:r>
     </w:p>
     <w:p>
       <w:pPr>
+        <w:spacing w:before="0" w:after="4000" w:line="240" w:lineRule="auto"/>
+      </w:pPr>
+      <w:r>
+        <w:rPr>
+          <w:rFonts w:ascii="宋体" w:hAnsi="宋体" w:eastAsia="宋体"/>
+          <w:b w:val="0"/>
+          <w:sz w:val="22"/>
+        </w:rPr>
+      </w:r>
+    </w:p>
+    <w:p>
+      <w:pPr>
+        <w:spacing w:before="0" w:after="0" w:line="240" w:lineRule="auto"/>
         <w:jc w:val="center"/>
       </w:pPr>
       <w:r>
         <w:rPr>
           <w:rFonts w:ascii="宋体" w:hAnsi="宋体" w:eastAsia="宋体"/>
-          <w:b/>
+          <w:b w:val="0"/>
           <w:color w:val="1E7EB8"/>
-          <w:sz w:val="20"/>
+          <w:sz w:val="16"/>
         </w:rPr>
-        <w:t>数学书桌 · Math Desk　·　第一单元·大数的认识　·　第 4 页</w:t>
-      </w:r>
-    </w:p>
-    <w:p>
-      <w:r>
-        <w:drawing>
-          <wp:inline xmlns:a="http://schemas.openxmlformats.org/drawingml/2006/main" xmlns:pic="http://schemas.openxmlformats.org/drawingml/2006/picture">
-            <wp:extent cx="6696000" cy="9520164"/>
-            <wp:docPr id="4" name="Picture 4"/>
-            <wp:cNvGraphicFramePr>
-              <a:graphicFrameLocks noChangeAspect="1"/>
-            </wp:cNvGraphicFramePr>
-            <a:graphic>
-              <a:graphicData uri="http://schemas.openxmlformats.org/drawingml/2006/picture">
-                <pic:pic>
-                  <pic:nvPicPr>
-                    <pic:cNvPr id="0" name="u01-p04.png"/>
-                    <pic:cNvPicPr/>
-                  </pic:nvPicPr>
-                  <pic:blipFill>
-                    <a:blip r:embed="rId12"/>
-                    <a:stretch>
-                      <a:fillRect/>
-                    </a:stretch>
-                  </pic:blipFill>
-                  <pic:spPr>
-                    <a:xfrm>
-                      <a:off x="0" y="0"/>
-                      <a:ext cx="6696000" cy="9520164"/>
-                    </a:xfrm>
-                    <a:prstGeom prst="rect"/>
-                  </pic:spPr>
-                </pic:pic>
-              </a:graphicData>
-            </a:graphic>
-          </wp:inline>
-        </w:drawing>
+        <w:t>数学 · 四上 · 第一单元　第 4 页（共 4 页）　|　清晰重排版（非扫描放大）</w:t>
       </w:r>
     </w:p>
     <w:sectPr>
       <w:pgSz w:w="11906" w:h="16838"/>
-      <w:pgMar w:top="567" w:right="680" w:bottom="567" w:left="680" w:header="720" w:footer="720" w:gutter="0"/>
+      <w:pgMar w:top="794" w:right="907" w:bottom="794" w:left="907" w:header="720" w:footer="720" w:gutter="0"/>
       <w:cols w:space="720"/>
       <w:docGrid w:linePitch="360"/>
     </w:sectPr>
@@ -648,6 +1510,10 @@
     <w:name w:val="Normal"/>
     <w:qFormat/>
     <w:rsid w:val="00FC693F"/>
+    <w:rPr>
+      <w:rFonts w:ascii="宋体" w:hAnsi="宋体" w:eastAsia="宋体"/>
+      <w:sz w:val="22"/>
+    </w:rPr>
   </w:style>
   <w:style w:type="paragraph" w:styleId="Header">
     <w:name w:val="header"/>

</xml_diff>

<commit_message>
Embed HD exam diagrams (abacus, place value, lines, obscured shapes) into clean U1/U5 papers.
Co-authored-by: Cursor <cursoragent@cursor.com>
</commit_message>
<xml_diff>
--- a/printables/u01/04-考前测试/U1_四上_第一单元_大数的认识.docx
+++ b/printables/u01/04-考前测试/U1_四上_第一单元_大数的认识.docx
@@ -214,34 +214,47 @@
           <w:b w:val="0"/>
           <w:sz w:val="22"/>
         </w:rPr>
-        <w:t>9. 算盘是我国古代的伟大发明。如图（原卷算盘图：十万位上珠为 5，万位下珠为 3），算盘表示的数写作______________。请在下面数线上用“↑”标出这个数的大致位置。</w:t>
+        <w:t>9. 算盘是我国古代的伟大发明。如图，算盘表示的数写作______________。请在下面数线上用“↑”标出这个数的大致位置。</w:t>
       </w:r>
     </w:p>
     <w:p>
       <w:pPr>
-        <w:spacing w:before="0" w:after="80" w:line="240" w:lineRule="auto"/>
+        <w:spacing w:after="120"/>
+        <w:jc w:val="center"/>
       </w:pPr>
       <w:r>
-        <w:rPr>
-          <w:rFonts w:ascii="宋体" w:hAnsi="宋体" w:eastAsia="宋体"/>
-          <w:b w:val="0"/>
-          <w:sz w:val="18"/>
-        </w:rPr>
-        <w:t xml:space="preserve">　　50万　|--------|--------|--------|--------|--------|--------|--------|--------|--------|--------|　60万</w:t>
-      </w:r>
-    </w:p>
-    <w:p>
-      <w:pPr>
-        <w:spacing w:before="0" w:after="80" w:line="240" w:lineRule="auto"/>
-      </w:pPr>
-      <w:r>
-        <w:rPr>
-          <w:rFonts w:ascii="宋体" w:hAnsi="宋体" w:eastAsia="宋体"/>
-          <w:b w:val="0"/>
-          <w:color w:val="1E7EB8"/>
-          <w:sz w:val="18"/>
-        </w:rPr>
-        <w:t xml:space="preserve">　　　　　　　　　　　　　（在约 53 万处标 ↑）</w:t>
+        <w:drawing>
+          <wp:inline xmlns:a="http://schemas.openxmlformats.org/drawingml/2006/main" xmlns:pic="http://schemas.openxmlformats.org/drawingml/2006/picture">
+            <wp:extent cx="5760000" cy="3702857"/>
+            <wp:docPr id="1" name="Picture 1"/>
+            <wp:cNvGraphicFramePr>
+              <a:graphicFrameLocks noChangeAspect="1"/>
+            </wp:cNvGraphicFramePr>
+            <a:graphic>
+              <a:graphicData uri="http://schemas.openxmlformats.org/drawingml/2006/picture">
+                <pic:pic>
+                  <pic:nvPicPr>
+                    <pic:cNvPr id="0" name="u1_abacus_numline_exact.jpg"/>
+                    <pic:cNvPicPr/>
+                  </pic:nvPicPr>
+                  <pic:blipFill>
+                    <a:blip r:embed="rId9"/>
+                    <a:stretch>
+                      <a:fillRect/>
+                    </a:stretch>
+                  </pic:blipFill>
+                  <pic:spPr>
+                    <a:xfrm>
+                      <a:off x="0" y="0"/>
+                      <a:ext cx="5760000" cy="3702857"/>
+                    </a:xfrm>
+                    <a:prstGeom prst="rect"/>
+                  </pic:spPr>
+                </pic:pic>
+              </a:graphicData>
+            </a:graphic>
+          </wp:inline>
+        </w:drawing>
       </w:r>
     </w:p>
     <w:p>
@@ -254,127 +267,49 @@
           <w:b w:val="0"/>
           <w:sz w:val="22"/>
         </w:rPr>
-        <w:t>10. 11 颗珠子，放在不同数位上表示的数不同。下表表示五位数 51023。</w:t>
+        <w:t>10. 11 颗珠子，放在不同数位上表示的数不同。下图表示五位数 51023。</w:t>
       </w:r>
     </w:p>
-    <w:tbl>
-      <w:tblPr>
-        <w:tblStyle w:val="TableGrid"/>
-        <w:tblW w:type="auto" w:w="0"/>
-        <w:tblLook w:firstColumn="1" w:firstRow="1" w:lastColumn="0" w:lastRow="0" w:noHBand="0" w:noVBand="1" w:val="04A0"/>
-      </w:tblPr>
-      <w:tblGrid>
-        <w:gridCol w:w="2018"/>
-        <w:gridCol w:w="2018"/>
-        <w:gridCol w:w="2018"/>
-        <w:gridCol w:w="2018"/>
-        <w:gridCol w:w="2018"/>
-      </w:tblGrid>
-      <w:tr>
-        <w:tc>
-          <w:tcPr>
-            <w:tcW w:type="dxa" w:w="2018"/>
-          </w:tcPr>
-          <w:p>
-            <w:r>
-              <w:t>万位</w:t>
-            </w:r>
-          </w:p>
-        </w:tc>
-        <w:tc>
-          <w:tcPr>
-            <w:tcW w:type="dxa" w:w="2018"/>
-          </w:tcPr>
-          <w:p>
-            <w:r>
-              <w:t>千位</w:t>
-            </w:r>
-          </w:p>
-        </w:tc>
-        <w:tc>
-          <w:tcPr>
-            <w:tcW w:type="dxa" w:w="2018"/>
-          </w:tcPr>
-          <w:p>
-            <w:r>
-              <w:t>百位</w:t>
-            </w:r>
-          </w:p>
-        </w:tc>
-        <w:tc>
-          <w:tcPr>
-            <w:tcW w:type="dxa" w:w="2018"/>
-          </w:tcPr>
-          <w:p>
-            <w:r>
-              <w:t>十位</w:t>
-            </w:r>
-          </w:p>
-        </w:tc>
-        <w:tc>
-          <w:tcPr>
-            <w:tcW w:type="dxa" w:w="2018"/>
-          </w:tcPr>
-          <w:p>
-            <w:r>
-              <w:t>个位</w:t>
-            </w:r>
-          </w:p>
-        </w:tc>
-      </w:tr>
-      <w:tr>
-        <w:tc>
-          <w:tcPr>
-            <w:tcW w:type="dxa" w:w="2018"/>
-          </w:tcPr>
-          <w:p>
-            <w:r>
-              <w:t>●●●●●</w:t>
-            </w:r>
-          </w:p>
-        </w:tc>
-        <w:tc>
-          <w:tcPr>
-            <w:tcW w:type="dxa" w:w="2018"/>
-          </w:tcPr>
-          <w:p>
-            <w:r>
-              <w:t>●</w:t>
-            </w:r>
-          </w:p>
-        </w:tc>
-        <w:tc>
-          <w:tcPr>
-            <w:tcW w:type="dxa" w:w="2018"/>
-          </w:tcPr>
-          <w:p>
-            <w:r>
-              <w:t>（空）</w:t>
-            </w:r>
-          </w:p>
-        </w:tc>
-        <w:tc>
-          <w:tcPr>
-            <w:tcW w:type="dxa" w:w="2018"/>
-          </w:tcPr>
-          <w:p>
-            <w:r>
-              <w:t>●●</w:t>
-            </w:r>
-          </w:p>
-        </w:tc>
-        <w:tc>
-          <w:tcPr>
-            <w:tcW w:type="dxa" w:w="2018"/>
-          </w:tcPr>
-          <w:p>
-            <w:r>
-              <w:t>●●●</w:t>
-            </w:r>
-          </w:p>
-        </w:tc>
-      </w:tr>
-    </w:tbl>
+    <w:p>
+      <w:pPr>
+        <w:spacing w:after="120"/>
+        <w:jc w:val="center"/>
+      </w:pPr>
+      <w:r>
+        <w:drawing>
+          <wp:inline xmlns:a="http://schemas.openxmlformats.org/drawingml/2006/main" xmlns:pic="http://schemas.openxmlformats.org/drawingml/2006/picture">
+            <wp:extent cx="5400000" cy="2340000"/>
+            <wp:docPr id="2" name="Picture 2"/>
+            <wp:cNvGraphicFramePr>
+              <a:graphicFrameLocks noChangeAspect="1"/>
+            </wp:cNvGraphicFramePr>
+            <a:graphic>
+              <a:graphicData uri="http://schemas.openxmlformats.org/drawingml/2006/picture">
+                <pic:pic>
+                  <pic:nvPicPr>
+                    <pic:cNvPr id="0" name="u1_place_value_exact.jpg"/>
+                    <pic:cNvPicPr/>
+                  </pic:nvPicPr>
+                  <pic:blipFill>
+                    <a:blip r:embed="rId10"/>
+                    <a:stretch>
+                      <a:fillRect/>
+                    </a:stretch>
+                  </pic:blipFill>
+                  <pic:spPr>
+                    <a:xfrm>
+                      <a:off x="0" y="0"/>
+                      <a:ext cx="5400000" cy="2340000"/>
+                    </a:xfrm>
+                    <a:prstGeom prst="rect"/>
+                  </pic:spPr>
+                </pic:pic>
+              </a:graphicData>
+            </a:graphic>
+          </wp:inline>
+        </w:drawing>
+      </w:r>
+    </w:p>
     <w:p>
       <w:pPr>
         <w:spacing w:before="0" w:after="160" w:line="240" w:lineRule="auto"/>
@@ -529,54 +464,42 @@
     </w:p>
     <w:p>
       <w:pPr>
-        <w:spacing w:before="0" w:after="80" w:line="240" w:lineRule="auto"/>
+        <w:spacing w:after="120"/>
+        <w:jc w:val="center"/>
       </w:pPr>
       <w:r>
-        <w:rPr>
-          <w:rFonts w:ascii="宋体" w:hAnsi="宋体" w:eastAsia="宋体"/>
-          <w:b w:val="0"/>
-          <w:sz w:val="22"/>
-        </w:rPr>
-        <w:t xml:space="preserve">　　① 计数器：十万位拨 1，万位拨 2（表示 120000）</w:t>
-      </w:r>
-    </w:p>
-    <w:p>
-      <w:pPr>
-        <w:spacing w:before="0" w:after="80" w:line="240" w:lineRule="auto"/>
-      </w:pPr>
-      <w:r>
-        <w:rPr>
-          <w:rFonts w:ascii="宋体" w:hAnsi="宋体" w:eastAsia="宋体"/>
-          <w:b w:val="0"/>
-          <w:sz w:val="22"/>
-        </w:rPr>
-        <w:t xml:space="preserve">　　② 用小正方形表示，每格表示 1000，画了 120 格</w:t>
-      </w:r>
-    </w:p>
-    <w:p>
-      <w:pPr>
-        <w:spacing w:before="0" w:after="80" w:line="240" w:lineRule="auto"/>
-      </w:pPr>
-      <w:r>
-        <w:rPr>
-          <w:rFonts w:ascii="宋体" w:hAnsi="宋体" w:eastAsia="宋体"/>
-          <w:b w:val="0"/>
-          <w:sz w:val="22"/>
-        </w:rPr>
-        <w:t xml:space="preserve">　　③ 数线：10万——20万，箭头指在正中间（约 15万）</w:t>
-      </w:r>
-    </w:p>
-    <w:p>
-      <w:pPr>
-        <w:spacing w:before="0" w:after="80" w:line="240" w:lineRule="auto"/>
-      </w:pPr>
-      <w:r>
-        <w:rPr>
-          <w:rFonts w:ascii="宋体" w:hAnsi="宋体" w:eastAsia="宋体"/>
-          <w:b w:val="0"/>
-          <w:sz w:val="22"/>
-        </w:rPr>
-        <w:t xml:space="preserve">　　④ 1×100000＋2×10000</w:t>
+        <w:drawing>
+          <wp:inline xmlns:a="http://schemas.openxmlformats.org/drawingml/2006/main" xmlns:pic="http://schemas.openxmlformats.org/drawingml/2006/picture">
+            <wp:extent cx="5580000" cy="3985714"/>
+            <wp:docPr id="3" name="Picture 3"/>
+            <wp:cNvGraphicFramePr>
+              <a:graphicFrameLocks noChangeAspect="1"/>
+            </wp:cNvGraphicFramePr>
+            <a:graphic>
+              <a:graphicData uri="http://schemas.openxmlformats.org/drawingml/2006/picture">
+                <pic:pic>
+                  <pic:nvPicPr>
+                    <pic:cNvPr id="0" name="u1_mc120000_exact.jpg"/>
+                    <pic:cNvPicPr/>
+                  </pic:nvPicPr>
+                  <pic:blipFill>
+                    <a:blip r:embed="rId11"/>
+                    <a:stretch>
+                      <a:fillRect/>
+                    </a:stretch>
+                  </pic:blipFill>
+                  <pic:spPr>
+                    <a:xfrm>
+                      <a:off x="0" y="0"/>
+                      <a:ext cx="5580000" cy="3985714"/>
+                    </a:xfrm>
+                    <a:prstGeom prst="rect"/>
+                  </pic:spPr>
+                </pic:pic>
+              </a:graphicData>
+            </a:graphic>
+          </wp:inline>
+        </w:drawing>
       </w:r>
     </w:p>
     <w:p>
@@ -620,15 +543,42 @@
     </w:p>
     <w:p>
       <w:pPr>
-        <w:spacing w:before="0" w:after="80" w:line="240" w:lineRule="auto"/>
+        <w:spacing w:after="120"/>
+        <w:jc w:val="center"/>
       </w:pPr>
       <w:r>
-        <w:rPr>
-          <w:rFonts w:ascii="宋体" w:hAnsi="宋体" w:eastAsia="宋体"/>
-          <w:b w:val="0"/>
-          <w:sz w:val="22"/>
-        </w:rPr>
-        <w:t xml:space="preserve">　　数线：50000——60000——70000，M 在 60000 与 70000 之间且靠近 60000 一侧约三分之一处。</w:t>
+        <w:drawing>
+          <wp:inline xmlns:a="http://schemas.openxmlformats.org/drawingml/2006/main" xmlns:pic="http://schemas.openxmlformats.org/drawingml/2006/picture">
+            <wp:extent cx="5040000" cy="1344000"/>
+            <wp:docPr id="4" name="Picture 4"/>
+            <wp:cNvGraphicFramePr>
+              <a:graphicFrameLocks noChangeAspect="1"/>
+            </wp:cNvGraphicFramePr>
+            <a:graphic>
+              <a:graphicData uri="http://schemas.openxmlformats.org/drawingml/2006/picture">
+                <pic:pic>
+                  <pic:nvPicPr>
+                    <pic:cNvPr id="0" name="u1_numline_M_exact.jpg"/>
+                    <pic:cNvPicPr/>
+                  </pic:nvPicPr>
+                  <pic:blipFill>
+                    <a:blip r:embed="rId12"/>
+                    <a:stretch>
+                      <a:fillRect/>
+                    </a:stretch>
+                  </pic:blipFill>
+                  <pic:spPr>
+                    <a:xfrm>
+                      <a:off x="0" y="0"/>
+                      <a:ext cx="5040000" cy="1344000"/>
+                    </a:xfrm>
+                    <a:prstGeom prst="rect"/>
+                  </pic:spPr>
+                </pic:pic>
+              </a:graphicData>
+            </a:graphic>
+          </wp:inline>
+        </w:drawing>
       </w:r>
     </w:p>
     <w:p>

</xml_diff>

<commit_message>
Restore clean Word/PDF exam papers instead of blurry JPG scans.
Rebuild U1–U5 from source content with diagrams; replace near-blank U6–U9 frameworks with readable Word exports so every unit pretest opens clearly.

Co-authored-by: Cursor <cursoragent@cursor.com>
</commit_message>
<xml_diff>
--- a/printables/u01/04-考前测试/U1_四上_第一单元_大数的认识.docx
+++ b/printables/u01/04-考前测试/U1_四上_第一单元_大数的认识.docx
@@ -29,7 +29,7 @@
           <w:color w:val="0F5F8A"/>
           <w:sz w:val="32"/>
         </w:rPr>
-        <w:t>数学 · 四上 · 第一单元练习</w:t>
+        <w:t>数学 · 四上 · 第一单元 · 大数的认识练习</w:t>
       </w:r>
     </w:p>
     <w:p>
@@ -43,7 +43,7 @@
           <w:b w:val="0"/>
           <w:sz w:val="22"/>
         </w:rPr>
-        <w:t>时间：40 分钟</w:t>
+        <w:t>时间：40 分钟　|　清晰重排（非扫描放大）</w:t>
       </w:r>
     </w:p>
     <w:p>

</xml_diff>

<commit_message>
Tighten exam layout spacing to match original JPG page fill.
Add answer blanks and question gaps so content reaches near page bottom without overflowing or rasterizing text.

Co-authored-by: Cursor <cursoragent@cursor.com>
</commit_message>
<xml_diff>
--- a/printables/u01/04-考前测试/U1_四上_第一单元_大数的认识.docx
+++ b/printables/u01/04-考前测试/U1_四上_第一单元_大数的认识.docx
@@ -4,7 +4,7 @@
   <w:body>
     <w:p>
       <w:pPr>
-        <w:spacing w:before="0" w:after="40" w:line="276" w:lineRule="auto"/>
+        <w:spacing w:before="0" w:after="40" w:line="307" w:lineRule="auto"/>
         <w:jc w:val="center"/>
       </w:pPr>
       <w:r>
@@ -18,7 +18,7 @@
     </w:p>
     <w:p>
       <w:pPr>
-        <w:spacing w:before="0" w:after="60" w:line="276" w:lineRule="auto"/>
+        <w:spacing w:before="0" w:after="60" w:line="307" w:lineRule="auto"/>
         <w:jc w:val="center"/>
       </w:pPr>
       <w:r>
@@ -32,7 +32,7 @@
     </w:p>
     <w:p>
       <w:pPr>
-        <w:spacing w:before="0" w:after="160" w:line="276" w:lineRule="auto"/>
+        <w:spacing w:before="0" w:after="160" w:line="307" w:lineRule="auto"/>
         <w:jc w:val="center"/>
       </w:pPr>
       <w:r>
@@ -46,7 +46,7 @@
     </w:p>
     <w:p>
       <w:pPr>
-        <w:spacing w:before="120" w:after="80" w:line="276" w:lineRule="auto"/>
+        <w:spacing w:before="120" w:after="80" w:line="307" w:lineRule="auto"/>
       </w:pPr>
       <w:r>
         <w:rPr>
@@ -59,7 +59,7 @@
     </w:p>
     <w:p>
       <w:pPr>
-        <w:spacing w:before="0" w:after="80" w:line="276" w:lineRule="auto"/>
+        <w:spacing w:before="0" w:after="120" w:line="307" w:lineRule="auto"/>
       </w:pPr>
       <w:r>
         <w:rPr>
@@ -72,7 +72,19 @@
     </w:p>
     <w:p>
       <w:pPr>
-        <w:spacing w:before="0" w:after="40" w:line="276" w:lineRule="auto"/>
+        <w:spacing w:before="0" w:after="560" w:line="240" w:lineRule="auto"/>
+      </w:pPr>
+      <w:r>
+        <w:rPr>
+          <w:rFonts w:ascii="宋体" w:hAnsi="宋体" w:eastAsia="宋体"/>
+          <w:b w:val="0"/>
+          <w:sz w:val="2"/>
+        </w:rPr>
+      </w:r>
+    </w:p>
+    <w:p>
+      <w:pPr>
+        <w:spacing w:before="0" w:after="80" w:line="307" w:lineRule="auto"/>
       </w:pPr>
       <w:r>
         <w:rPr>
@@ -85,7 +97,7 @@
     </w:p>
     <w:p>
       <w:pPr>
-        <w:spacing w:before="0" w:after="40" w:line="276" w:lineRule="auto"/>
+        <w:spacing w:before="0" w:after="80" w:line="307" w:lineRule="auto"/>
       </w:pPr>
       <w:r>
         <w:rPr>
@@ -98,7 +110,7 @@
     </w:p>
     <w:p>
       <w:pPr>
-        <w:spacing w:before="0" w:after="80" w:line="276" w:lineRule="auto"/>
+        <w:spacing w:before="0" w:after="120" w:line="307" w:lineRule="auto"/>
       </w:pPr>
       <w:r>
         <w:rPr>
@@ -111,7 +123,19 @@
     </w:p>
     <w:p>
       <w:pPr>
-        <w:spacing w:before="0" w:after="80" w:line="276" w:lineRule="auto"/>
+        <w:spacing w:before="0" w:after="560" w:line="240" w:lineRule="auto"/>
+      </w:pPr>
+      <w:r>
+        <w:rPr>
+          <w:rFonts w:ascii="宋体" w:hAnsi="宋体" w:eastAsia="宋体"/>
+          <w:b w:val="0"/>
+          <w:sz w:val="2"/>
+        </w:rPr>
+      </w:r>
+    </w:p>
+    <w:p>
+      <w:pPr>
+        <w:spacing w:before="0" w:after="120" w:line="307" w:lineRule="auto"/>
       </w:pPr>
       <w:r>
         <w:rPr>
@@ -124,7 +148,19 @@
     </w:p>
     <w:p>
       <w:pPr>
-        <w:spacing w:before="0" w:after="80" w:line="276" w:lineRule="auto"/>
+        <w:spacing w:before="0" w:after="560" w:line="240" w:lineRule="auto"/>
+      </w:pPr>
+      <w:r>
+        <w:rPr>
+          <w:rFonts w:ascii="宋体" w:hAnsi="宋体" w:eastAsia="宋体"/>
+          <w:b w:val="0"/>
+          <w:sz w:val="2"/>
+        </w:rPr>
+      </w:r>
+    </w:p>
+    <w:p>
+      <w:pPr>
+        <w:spacing w:before="0" w:after="120" w:line="307" w:lineRule="auto"/>
       </w:pPr>
       <w:r>
         <w:rPr>
@@ -137,7 +173,19 @@
     </w:p>
     <w:p>
       <w:pPr>
-        <w:spacing w:before="0" w:after="80" w:line="276" w:lineRule="auto"/>
+        <w:spacing w:before="0" w:after="560" w:line="240" w:lineRule="auto"/>
+      </w:pPr>
+      <w:r>
+        <w:rPr>
+          <w:rFonts w:ascii="宋体" w:hAnsi="宋体" w:eastAsia="宋体"/>
+          <w:b w:val="0"/>
+          <w:sz w:val="2"/>
+        </w:rPr>
+      </w:r>
+    </w:p>
+    <w:p>
+      <w:pPr>
+        <w:spacing w:before="0" w:after="120" w:line="307" w:lineRule="auto"/>
       </w:pPr>
       <w:r>
         <w:rPr>
@@ -150,7 +198,19 @@
     </w:p>
     <w:p>
       <w:pPr>
-        <w:spacing w:before="0" w:after="80" w:line="276" w:lineRule="auto"/>
+        <w:spacing w:before="0" w:after="560" w:line="240" w:lineRule="auto"/>
+      </w:pPr>
+      <w:r>
+        <w:rPr>
+          <w:rFonts w:ascii="宋体" w:hAnsi="宋体" w:eastAsia="宋体"/>
+          <w:b w:val="0"/>
+          <w:sz w:val="2"/>
+        </w:rPr>
+      </w:r>
+    </w:p>
+    <w:p>
+      <w:pPr>
+        <w:spacing w:before="0" w:after="120" w:line="307" w:lineRule="auto"/>
       </w:pPr>
       <w:r>
         <w:rPr>
@@ -163,7 +223,19 @@
     </w:p>
     <w:p>
       <w:pPr>
-        <w:spacing w:before="0" w:after="40" w:line="276" w:lineRule="auto"/>
+        <w:spacing w:before="0" w:after="560" w:line="240" w:lineRule="auto"/>
+      </w:pPr>
+      <w:r>
+        <w:rPr>
+          <w:rFonts w:ascii="宋体" w:hAnsi="宋体" w:eastAsia="宋体"/>
+          <w:b w:val="0"/>
+          <w:sz w:val="2"/>
+        </w:rPr>
+      </w:r>
+    </w:p>
+    <w:p>
+      <w:pPr>
+        <w:spacing w:before="0" w:after="120" w:line="307" w:lineRule="auto"/>
       </w:pPr>
       <w:r>
         <w:rPr>
@@ -176,7 +248,7 @@
     </w:p>
     <w:p>
       <w:pPr>
-        <w:spacing w:before="0" w:after="40" w:line="276" w:lineRule="auto"/>
+        <w:spacing w:before="0" w:after="200" w:line="307" w:lineRule="auto"/>
       </w:pPr>
       <w:r>
         <w:rPr>
@@ -189,7 +261,7 @@
     </w:p>
     <w:p>
       <w:pPr>
-        <w:spacing w:before="0" w:after="80" w:line="276" w:lineRule="auto"/>
+        <w:spacing w:before="0" w:after="160" w:line="307" w:lineRule="auto"/>
       </w:pPr>
       <w:r>
         <w:rPr>
@@ -202,7 +274,7 @@
     </w:p>
     <w:p>
       <w:pPr>
-        <w:spacing w:before="120" w:after="0" w:line="276" w:lineRule="auto"/>
+        <w:spacing w:before="120" w:after="0" w:line="307" w:lineRule="auto"/>
         <w:jc w:val="center"/>
       </w:pPr>
       <w:r>
@@ -217,7 +289,7 @@
     </w:p>
     <w:sectPr>
       <w:pgSz w:w="11906" w:h="16838"/>
-      <w:pgMar w:top="624" w:right="850" w:bottom="624" w:left="850" w:header="720" w:footer="720" w:gutter="0"/>
+      <w:pgMar w:top="680" w:right="907" w:bottom="680" w:left="907" w:header="720" w:footer="720" w:gutter="0"/>
       <w:cols w:space="720"/>
       <w:docGrid w:linePitch="360"/>
     </w:sectPr>

</xml_diff>